<commit_message>
Convert all course materials to American English
The user has asked for American English more than once across projects; an
earlier session said it would be noted but never wrote it anywhere persistent,
so the whole site was written in British English.

- ~/.claude/CLAUDE.md created with the rule and a word list, so it now applies
  to every project rather than being re-explained each time
- 37 source files corrected: organise/recognise/normalise/generalise/
  initialise/minimise/materialise/characterise, behaviour, colour, favour,
  honour, neighbour, centre/centred, labelled/labelling, afterwards, analyse
- everything regenerated from the corrected sources; 12 code folders still
  build clean and every cumulative test still passes

Co-Authored-By: Claude Opus 5 (1M context) <noreply@anthropic.com>
Claude-Session: https://claude.ai/code/session_01Quke8svP5C3b16f71QaFB4
</commit_message>
<xml_diff>
--- a/docs/topic-1-lexical-analysis/CST-405-Topic-1-Project-1.docx
+++ b/docs/topic-1-lexical-analysis/CST-405-Topic-1-Project-1.docx
@@ -182,7 +182,7 @@
         <w:spacing w:after="60"/>
       </w:pPr>
       <w:r>
-        <w:t>The scanner recognises EVERY keyword, operator, delimiter, identifier and integer literal in the provided grammar. Include the keywords used only in later topics (if, else, while, for, switch, case, default, break, return): adding them now costs one line each and saves editing this file in week 12.</w:t>
+        <w:t>The scanner recognizes EVERY keyword, operator, delimiter, identifier and integer literal in the provided grammar. Include the keywords used only in later topics (if, else, while, for, switch, case, default, break, return): adding them now costs one line each and saves editing this file in week 12.</w:t>
       </w:r>
     </w:p>
     <w:p>
@@ -308,7 +308,7 @@
         <w:t xml:space="preserve">Floating-point literals — </w:t>
       </w:r>
       <w:r>
-        <w:t>Recognising them is easy; note in your write-up what it would cost the rest of the compiler to support them.</w:t>
+        <w:t>Recognizing them is easy; note in your write-up what it would cost the rest of the compiler to support them.</w:t>
       </w:r>
     </w:p>
     <w:p>
@@ -368,10 +368,10 @@
         <w:rPr>
           <w:b/>
         </w:rPr>
-        <w:t xml:space="preserve">"Recognises every valid keyword, expression, or construct" — </w:t>
+        <w:t xml:space="preserve">"Recognizes every valid keyword, expression, or construct" — </w:t>
       </w:r>
       <w:r>
-        <w:t>A scanner recognises TOKENS, not expressions or constructs — those are the parser's job in Topic 2. What is being asked for here is complete token coverage. Being able to state that boundary crisply is itself part of the assessment.</w:t>
+        <w:t>A scanner recognizes TOKENS, not expressions or constructs — those are the parser's job in Topic 2. What is being asked for here is complete token coverage. Being able to state that boundary crisply is itself part of the assessment.</w:t>
       </w:r>
     </w:p>
     <w:p>
@@ -485,7 +485,7 @@
         <w:spacing w:after="60"/>
       </w:pPr>
       <w:r>
-        <w:t>Every grammar rule with a non-trivial action is commented with the construct it recognises and the AST node it builds.</w:t>
+        <w:t>Every grammar rule with a non-trivial action is commented with the construct it recognizes and the AST node it builds.</w:t>
       </w:r>
     </w:p>
     <w:p>
@@ -593,7 +593,7 @@
         <w:t xml:space="preserve">Show it working, first — </w:t>
       </w:r>
       <w:r>
-        <w:t>Open with the compiler running on a non-trivial program, end to end, including executing the generated assembly. Do this before any explanation. Everything you say afterwards lands differently once the viewer has seen the thing work.</w:t>
+        <w:t>Open with the compiler running on a non-trivial program, end to end, including executing the generated assembly. Do this before any explanation. Everything you say afterward lands differently once the viewer has seen the thing work.</w:t>
       </w:r>
     </w:p>
     <w:p>

</xml_diff>